<commit_message>
Actualiza el informe con el enlace del repositorio
</commit_message>
<xml_diff>
--- a/docs/Documento_Diseno_Ajustado.docx
+++ b/docs/Documento_Diseno_Ajustado.docx
@@ -14686,7 +14686,7 @@
                 <w:b w:val="0"/>
                 <w:sz w:val="16"/>
               </w:rPr>
-              <w:t>Repositorio (GitHub o GitLab)</w:t>
+              <w:t>Repositorio (GitHub)</w:t>
             </w:r>
           </w:p>
         </w:tc>
@@ -14704,7 +14704,7 @@
                 <w:b w:val="0"/>
                 <w:sz w:val="16"/>
               </w:rPr>
-              <w:t>PENDIENTE: no se ha publicado</w:t>
+              <w:t>Publicado (commit 2bc6a2a; el integrante comprobó que abre sin iniciar sesión)</w:t>
             </w:r>
           </w:p>
         </w:tc>
@@ -14722,7 +14722,7 @@
                 <w:b w:val="0"/>
                 <w:sz w:val="16"/>
               </w:rPr>
-              <w:t>Crear el repositorio, ejecutar «git init», «git add .», «git commit» y «git push» (ver README, sección Git); pegar aquí la URL real.</w:t>
+              <w:t>https://github.com/stevencontre/creditscore-agent</w:t>
             </w:r>
           </w:p>
         </w:tc>

</xml_diff>

<commit_message>
Agrega app web Streamlit (Opción A)
</commit_message>
<xml_diff>
--- a/docs/Documento_Diseno_Ajustado.docx
+++ b/docs/Documento_Diseno_Ajustado.docx
@@ -6578,7 +6578,7 @@
                 <w:b w:val="0"/>
                 <w:sz w:val="14"/>
               </w:rPr>
-              <w:t>Streamlit / Hugging Face Spaces</w:t>
+              <w:t>Streamlit y pandas (app.py)</w:t>
             </w:r>
           </w:p>
         </w:tc>
@@ -6596,7 +6596,7 @@
                 <w:b w:val="0"/>
                 <w:sz w:val="14"/>
               </w:rPr>
-              <w:t>—</w:t>
+              <w:t>1.66.0 (probada)</w:t>
             </w:r>
           </w:p>
         </w:tc>
@@ -6614,7 +6614,7 @@
                 <w:b w:val="0"/>
                 <w:sz w:val="14"/>
               </w:rPr>
-              <w:t>Despliegue (Opción A)</w:t>
+              <w:t>Interfaz web y despliegue público (Opción A)</w:t>
             </w:r>
           </w:p>
         </w:tc>
@@ -6632,7 +6632,7 @@
                 <w:b w:val="0"/>
                 <w:sz w:val="14"/>
               </w:rPr>
-              <w:t>Demostración pública</w:t>
+              <w:t>Evalúa solicitudes y ejecuta las pruebas en vivo; despliegue gratuito desde GitHub</w:t>
             </w:r>
           </w:p>
         </w:tc>
@@ -6668,7 +6668,7 @@
                 <w:b w:val="0"/>
                 <w:sz w:val="14"/>
               </w:rPr>
-              <w:t>Se eligió la Opción B; no se escribió ni probó código de despliegue</w:t>
+              <w:t>Los integrantes no pueden grabar juntos; la interfaz no contiene lógica de decisión</w:t>
             </w:r>
           </w:p>
         </w:tc>
@@ -6686,7 +6686,7 @@
                 <w:b w:val="0"/>
                 <w:sz w:val="14"/>
               </w:rPr>
-              <w:t>Solo evaluada</w:t>
+              <w:t>Usada</w:t>
             </w:r>
           </w:p>
         </w:tc>
@@ -10505,6 +10505,101 @@
                 <w:b w:val="0"/>
                 <w:sz w:val="14"/>
               </w:rPr>
+              <w:t>Entrada por formulario</w:t>
+            </w:r>
+          </w:p>
+        </w:tc>
+        <w:tc>
+          <w:tcPr>
+            <w:tcW w:type="dxa" w:w="2154"/>
+          </w:tcPr>
+          <w:p>
+            <w:pPr>
+              <w:spacing w:after="0"/>
+            </w:pPr>
+            <w:r/>
+            <w:r>
+              <w:rPr>
+                <w:b w:val="0"/>
+                <w:sz w:val="14"/>
+              </w:rPr>
+              <w:t>app.py: interfaz web</w:t>
+            </w:r>
+          </w:p>
+        </w:tc>
+        <w:tc>
+          <w:tcPr>
+            <w:tcW w:type="dxa" w:w="1701"/>
+          </w:tcPr>
+          <w:p>
+            <w:pPr>
+              <w:spacing w:after="0"/>
+            </w:pPr>
+            <w:r/>
+            <w:r>
+              <w:rPr>
+                <w:b w:val="0"/>
+                <w:sz w:val="14"/>
+              </w:rPr>
+              <w:t>No estaba en el diseño</w:t>
+            </w:r>
+          </w:p>
+        </w:tc>
+        <w:tc>
+          <w:tcPr>
+            <w:tcW w:type="dxa" w:w="1814"/>
+          </w:tcPr>
+          <w:p>
+            <w:pPr>
+              <w:spacing w:after="0"/>
+            </w:pPr>
+            <w:r/>
+            <w:r>
+              <w:rPr>
+                <w:b w:val="0"/>
+                <w:sz w:val="14"/>
+              </w:rPr>
+              <w:t>Opción A</w:t>
+            </w:r>
+          </w:p>
+        </w:tc>
+        <w:tc>
+          <w:tcPr>
+            <w:tcW w:type="dxa" w:w="1701"/>
+          </w:tcPr>
+          <w:p>
+            <w:pPr>
+              <w:spacing w:after="0"/>
+            </w:pPr>
+            <w:r/>
+            <w:r>
+              <w:rPr>
+                <w:b w:val="0"/>
+                <w:sz w:val="14"/>
+              </w:rPr>
+              <w:t>Ninguno</w:t>
+            </w:r>
+          </w:p>
+        </w:tc>
+      </w:tr>
+      <w:tr>
+        <w:trPr>
+          <w:cantSplit w:val="true"/>
+        </w:trPr>
+        <w:tc>
+          <w:tcPr>
+            <w:tcW w:type="dxa" w:w="1928"/>
+          </w:tcPr>
+          <w:p>
+            <w:pPr>
+              <w:spacing w:after="0"/>
+            </w:pPr>
+            <w:r/>
+            <w:r>
+              <w:rPr>
+                <w:b w:val="0"/>
+                <w:sz w:val="14"/>
+              </w:rPr>
               <w:t>Métricas complementarias (precisión, recall, falsos positivos, subgrupos)</w:t>
             </w:r>
           </w:p>
@@ -12575,7 +12670,7 @@
           <w:i/>
           <w:sz w:val="16"/>
         </w:rPr>
-        <w:t>El minuto del video se completa cuando se grabe la demostración (ver docs/guion_video.md); mientras tanto la evidencia verificable son los archivos de la columna final.</w:t>
+        <w:t>Evidencia de funcionamiento (Opción A): la pestaña «3. Pruebas» de la app desplegada ejecuta en vivo las pruebas unitarias, los 17 escenarios y las medidas M1–M7 y muestra esta misma tabla; los archivos de la columna final son el respaldo.</w:t>
       </w:r>
     </w:p>
     <w:p>
@@ -14576,7 +14671,7 @@
         <w:spacing w:after="40"/>
       </w:pPr>
       <w:r>
-        <w:t xml:space="preserve"> Baja: persistir la memoria de largo plazo entre ejecuciones, programar la revisión de aprendizaje y exponer el agente con una interfaz web (Opción A de despliegue).</w:t>
+        <w:t xml:space="preserve"> Baja: persistir la memoria de largo plazo entre ejecuciones, programar la revisión de aprendizaje.</w:t>
       </w:r>
     </w:p>
     <w:p>
@@ -14704,7 +14799,7 @@
                 <w:b w:val="0"/>
                 <w:sz w:val="16"/>
               </w:rPr>
-              <w:t>Publicado (commit 2bc6a2a; el integrante comprobó que abre sin iniciar sesión)</w:t>
+              <w:t>Publicado (comprobado por el integrante: abre sin iniciar sesión)</w:t>
             </w:r>
           </w:p>
         </w:tc>
@@ -14745,7 +14840,7 @@
                 <w:b w:val="0"/>
                 <w:sz w:val="16"/>
               </w:rPr>
-              <w:t>Video de la demostración (máximo 20 minutos)</w:t>
+              <w:t>Plataforma de despliegue (Opción A: Streamlit Community Cloud)</w:t>
             </w:r>
           </w:p>
         </w:tc>
@@ -14763,7 +14858,7 @@
                 <w:b w:val="0"/>
                 <w:sz w:val="16"/>
               </w:rPr>
-              <w:t>PENDIENTE: no se ha grabado</w:t>
+              <w:t>PENDIENTE: no se ha desplegado</w:t>
             </w:r>
           </w:p>
         </w:tc>
@@ -14781,7 +14876,7 @@
                 <w:b w:val="0"/>
                 <w:sz w:val="16"/>
               </w:rPr>
-              <w:t>Grabar siguiendo docs/guion_video.md con cámara y voz de ambos integrantes; subirlo a YouTube (no listado), OneDrive o Drive con acceso habilitado; pegar aquí el enlace y completar los minutos en la tabla de resultados.</w:t>
+              <w:t>Desplegar siguiendo docs/guia_despliegue.md y pegar aquí la URL.</w:t>
             </w:r>
           </w:p>
         </w:tc>
@@ -14804,7 +14899,7 @@
                 <w:b w:val="0"/>
                 <w:sz w:val="16"/>
               </w:rPr>
-              <w:t>Plataforma de despliegue</w:t>
+              <w:t>Instrucciones de uso y casos de prueba sugeridos</w:t>
             </w:r>
           </w:p>
         </w:tc>
@@ -14822,7 +14917,66 @@
                 <w:b w:val="0"/>
                 <w:sz w:val="16"/>
               </w:rPr>
-              <w:t>No aplica: se eligió la Opción B (video)</w:t>
+              <w:t>En el repositorio</w:t>
+            </w:r>
+          </w:p>
+        </w:tc>
+        <w:tc>
+          <w:tcPr>
+            <w:tcW w:type="dxa" w:w="4195"/>
+          </w:tcPr>
+          <w:p>
+            <w:pPr>
+              <w:spacing w:after="0"/>
+            </w:pPr>
+            <w:r/>
+            <w:r>
+              <w:rPr>
+                <w:b w:val="0"/>
+                <w:sz w:val="16"/>
+              </w:rPr>
+              <w:t>docs/guia_despliegue.md y pestaña «Evaluar una solicitud» de la app</w:t>
+            </w:r>
+          </w:p>
+        </w:tc>
+      </w:tr>
+      <w:tr>
+        <w:trPr>
+          <w:cantSplit w:val="true"/>
+        </w:trPr>
+        <w:tc>
+          <w:tcPr>
+            <w:tcW w:type="dxa" w:w="2551"/>
+          </w:tcPr>
+          <w:p>
+            <w:pPr>
+              <w:spacing w:after="0"/>
+            </w:pPr>
+            <w:r/>
+            <w:r>
+              <w:rPr>
+                <w:b w:val="0"/>
+                <w:sz w:val="16"/>
+              </w:rPr>
+              <w:t>Video de la demostración</w:t>
+            </w:r>
+          </w:p>
+        </w:tc>
+        <w:tc>
+          <w:tcPr>
+            <w:tcW w:type="dxa" w:w="2551"/>
+          </w:tcPr>
+          <w:p>
+            <w:pPr>
+              <w:spacing w:after="0"/>
+            </w:pPr>
+            <w:r/>
+            <w:r>
+              <w:rPr>
+                <w:b w:val="0"/>
+                <w:sz w:val="16"/>
+              </w:rPr>
+              <w:t>No aplica: se eligió la Opción A (plataforma de despliegue)</w:t>
             </w:r>
           </w:p>
         </w:tc>

</xml_diff>

<commit_message>
Agrega URL de la app desplegada
</commit_message>
<xml_diff>
--- a/docs/Documento_Diseno_Ajustado.docx
+++ b/docs/Documento_Diseno_Ajustado.docx
@@ -14858,7 +14858,7 @@
                 <w:b w:val="0"/>
                 <w:sz w:val="16"/>
               </w:rPr>
-              <w:t>PENDIENTE: no se ha desplegado</w:t>
+              <w:t>Publicada; disponible hasta la fecha de calificación</w:t>
             </w:r>
           </w:p>
         </w:tc>
@@ -14876,7 +14876,7 @@
                 <w:b w:val="0"/>
                 <w:sz w:val="16"/>
               </w:rPr>
-              <w:t>Desplegar siguiendo docs/guia_despliegue.md y pegar aquí la URL.</w:t>
+              <w:t>https://creditscore-agent-7pyg7dzx7yiykdggfwoinw.streamlit.app/</w:t>
             </w:r>
           </w:p>
         </w:tc>

</xml_diff>

<commit_message>
Informe final con M2b, referencias verificadas y bitacora
</commit_message>
<xml_diff>
--- a/docs/Documento_Diseno_Ajustado.docx
+++ b/docs/Documento_Diseno_Ajustado.docx
@@ -15016,7 +15016,7 @@
         <w:rPr>
           <w:b w:val="0"/>
         </w:rPr>
-        <w:t>El código, los diagramas y este documento se prepararon con ayuda de un asistente de IA (Claude, de Anthropic). Los resultados numéricos provienen de ejecuciones reales del código incluido. La bitácora docs/bitacora_uso_ia.md registra el uso; los campos de verificación humana están pendientes de completar por los integrantes, que deben revisar y poder explicar el código y el documento.</w:t>
+        <w:t>El código, los diagramas y este documento se prepararon con ayuda de un asistente de IA (Claude, de Anthropic). Los resultados numéricos provienen de ejecuciones reales del código incluido. La bitácora docs/bitacora_uso_ia.md registra el uso y la verificación realizada por los integrantes, que deben revisar y poder explicar el código y el documento.</w:t>
       </w:r>
     </w:p>
     <w:p>
@@ -15080,7 +15080,7 @@
           <w:i w:val="0"/>
           <w:sz w:val="18"/>
         </w:rPr>
-        <w:t>IBM. (2025). Componentes de los agentes de IA. IBM Think. https://www.ibm.com/mxes/think/topics/components-of-ai-agents (enlace por verificar).</w:t>
+        <w:t>IBM. (2025, 10 de marzo). What are the components of AI agents? [Artículo de C. Stryker]. IBM Think. https://www.ibm.com/think/topics/components-of-ai-agents</w:t>
       </w:r>
     </w:p>
     <w:p>
@@ -15100,7 +15100,7 @@
           <w:i w:val="0"/>
           <w:sz w:val="18"/>
         </w:rPr>
-        <w:t>Nortey, E. N. N., Asante-Koranteng, J., Atemkeng, M., Ansah-Narh, T., Mensah, D., Davis, R., y Laryea, R. A. (2026). An Optimised Greedy-Weighted Ensemble Framework for Financial Loan Default Prediction. arXiv:2603.18927 (referencia heredada de la entrega anterior; los integrantes deben verificar que exista antes de entregar).</w:t>
+        <w:t>Nortey, E. N. N., Asante-Koranteng, J., Atemkeng, M., Ansah-Narh, T., Mensah, D., Davis, R., y Laryea, R. A. (2026). An Optimised Greedy-Weighted Ensemble Framework for Financial Loan Default Prediction. arXiv:2603.18927. https://arxiv.org/abs/2603.18927</w:t>
       </w:r>
     </w:p>
     <w:p>

</xml_diff>

<commit_message>
Actualiza matriz de decision con el caso de uso de Cartrescue
</commit_message>
<xml_diff>
--- a/docs/Documento_Diseno_Ajustado.docx
+++ b/docs/Documento_Diseno_Ajustado.docx
@@ -899,13 +899,13 @@
         <w:rPr>
           <w:b/>
         </w:rPr>
-        <w:t xml:space="preserve">Advertencia de método. </w:t>
+        <w:t xml:space="preserve">Fuente de los puntajes del agente B. </w:t>
       </w:r>
       <w:r>
         <w:rPr>
           <w:b w:val="0"/>
         </w:rPr>
-        <w:t>El documento de diseño de Cartrescue-agent no estaba disponible al elaborar esta versión. Por eso todas las puntuaciones del agente B son estimaciones basadas solo en su nombre y propósito general, y están marcadas como ESTIMACIÓN. Las del agente A se apoyan en su diseño y en el prototipo construido, lo que introduce un sesgo de información a favor de A. Los integrantes deben revisar las filas de B contra su diseño real y volver a ejecutar «python scripts/matriz_decision.py» después de editar docs/matriz_decision.json.</w:t>
+        <w:t>El documento de diseño completo de Cartrescue-agent no estaba disponible al elaborar esta versión. Sus puntajes se sustentan en la descripción oficial del caso (Intelligent Agents – Use Cases, p. 3) y en las características del conjunto público REES46, no en el diseño del compañero; por eso se marcan como «caso de uso». Los del agente A se apoyan en su diseño y en el prototipo construido, lo que puede sesgar la comparación a favor de A. Los integrantes deben contrastar las filas de B con su diseño real y, si cambian, volver a ejecutar «python scripts/matriz_decision.py» después de editar docs/matriz_decision.json.</w:t>
       </w:r>
     </w:p>
     <w:p>
@@ -919,7 +919,7 @@
           <w:i w:val="0"/>
           <w:sz w:val="17"/>
         </w:rPr>
-        <w:t>Tabla A1. Matriz de decisión ponderada (A = CREDITSCORE-AGENT; B = Cartrescue-agent, puntajes estimados)</w:t>
+        <w:t>Tabla A1. Matriz de decisión ponderada (A = CREDITSCORE-AGENT; B = Cartrescue-agent, puntajes según el caso de uso)</w:t>
       </w:r>
     </w:p>
     <w:tbl>
@@ -1148,7 +1148,7 @@
                 <w:b w:val="0"/>
                 <w:sz w:val="14"/>
               </w:rPr>
-              <w:t>ESTIMACIÓN: el diseño no fue revisado. Un agente de reglas/utilidad sobre eventos de carrito es técnicamente simple de implementar en Python.</w:t>
+              <w:t>Caso de uso de Cartrescue (Intelligent Agents – Use Cases, p. 3). El caso describe percepción de eventos de carrito, un modelo de probabilidad de abandono, una decisión de intervención según el desempeño histórico y actuadores de correo o descuentos. Cinco de esos seis componentes (percepción simulada, modelo de probabilidad, decisión, actuadores simulados y registro de resultados con aprendizaje) ya se implementaron en el otro agente; falta la captura en tiempo real en el navegador (movimiento del ratón).</w:t>
             </w:r>
           </w:p>
         </w:tc>
@@ -1243,7 +1243,7 @@
                 <w:b w:val="0"/>
                 <w:sz w:val="14"/>
               </w:rPr>
-              <w:t>3</w:t>
+              <w:t>4</w:t>
             </w:r>
           </w:p>
         </w:tc>
@@ -1261,7 +1261,7 @@
                 <w:b w:val="0"/>
                 <w:sz w:val="14"/>
               </w:rPr>
-              <w:t>ESTIMACIÓN: tampoco hay acceso a una tienda en línea ni a sesiones reales; se requeriría un simulador de carritos y comportamiento de compra.</w:t>
+              <w:t>Caso de uso de Cartrescue (Intelligent Agents – Use Cases, p. 3). El caso recomienda usar el clickstream de la tienda o, alternativamente, el conjunto público REES46 (más de 30 millones de eventos). REES46 trae eventos view, cart, remove_from_cart y purchase por sesión, de los que se puede derivar el abandono; no trae movimientos del ratón ni respuestas a intervenciones, que habría que simular.</w:t>
             </w:r>
           </w:p>
         </w:tc>
@@ -1356,7 +1356,7 @@
                 <w:b w:val="0"/>
                 <w:sz w:val="14"/>
               </w:rPr>
-              <w:t>4</w:t>
+              <w:t>3</w:t>
             </w:r>
           </w:p>
         </w:tc>
@@ -1374,7 +1374,7 @@
                 <w:b w:val="0"/>
                 <w:sz w:val="14"/>
               </w:rPr>
-              <w:t>ESTIMACIÓN: la tasa de recuperación y de conversión de carritos son medibles de forma objetiva; se desconocen sus umbrales en el diseño.</w:t>
+              <w:t>Caso de uso de Cartrescue (Intelligent Agents – Use Cases, p. 3). La meta del caso (recuperar al menos 15 % más de carritos que la tasa actual durante tres semanas) exige una tienda piloto, una tasa base real y un grupo de comparación; con datos simulados el efecto lo fijaría el propio simulador. Sí se pueden medir sin tienda el AUC del modelo de abandono y la latencia.</w:t>
             </w:r>
           </w:p>
         </w:tc>
@@ -1469,7 +1469,7 @@
                 <w:b w:val="0"/>
                 <w:sz w:val="14"/>
               </w:rPr>
-              <w:t>3</w:t>
+              <w:t>4</w:t>
             </w:r>
           </w:p>
         </w:tc>
@@ -1487,7 +1487,7 @@
                 <w:b w:val="0"/>
                 <w:sz w:val="14"/>
               </w:rPr>
-              <w:t>ESTIMACIÓN: probablemente basado en reglas o utilidad (momento y canal del recordatorio), con aprendizaje solo si el diseño lo incluye.</w:t>
+              <w:t>Caso de uso de Cartrescue (Intelligent Agents – Use Cases, p. 3). Un modelo estima la probabilidad de abandono y la intervención (recordatorio, descuento o producto alternativo) se elige según el perfil y el desempeño histórico por tipo, registrando el resultado para refinar la estrategia: agente de aprendizaje con decisión por utilidad. No llega a 5 porque el caso no menciona detección de deriva ni abstención por incertidumbre.</w:t>
             </w:r>
           </w:p>
         </w:tc>
@@ -1600,7 +1600,7 @@
                 <w:b w:val="0"/>
                 <w:sz w:val="14"/>
               </w:rPr>
-              <w:t>ESTIMACIÓN: el envío real de correos, SMS o WhatsApp suele requerir APIs con cuota o costo.</w:t>
+              <w:t>Caso de uso de Cartrescue (Intelligent Agents – Use Cases, p. 3). El caso exige una tienda piloto durante tres semanas, un servicio de correo o notificaciones push y un motor de descuentos. Pueden simularse sin costo, pero una prueba real requeriría permisos y servicios con cuota.</w:t>
             </w:r>
           </w:p>
         </w:tc>
@@ -1713,7 +1713,7 @@
                 <w:b w:val="0"/>
                 <w:sz w:val="14"/>
               </w:rPr>
-              <w:t>ESTIMACIÓN: usuario identificable (tienda en línea) y beneficio concreto (ventas recuperadas).</w:t>
+              <w:t>Caso de uso de Cartrescue (Intelligent Agents – Use Cases, p. 3). Usuario identificable (la tienda en línea) y beneficio concreto (carritos recuperados, es decir, ventas); el caso cita la fuente de diseño de Datagrid sobre el ROI del abandono de carritos. El beneficio no se verificó con datos reales.</w:t>
             </w:r>
           </w:p>
         </w:tc>
@@ -1807,7 +1807,7 @@
                 <w:b/>
                 <w:sz w:val="14"/>
               </w:rPr>
-              <w:t>3,55</w:t>
+              <w:t>3,70</w:t>
             </w:r>
           </w:p>
         </w:tc>
@@ -1877,7 +1877,7 @@
           <w:rFonts w:ascii="Consolas" w:hAnsi="Consolas" w:eastAsia="Consolas"/>
           <w:sz w:val="16"/>
         </w:rPr>
-        <w:t>S(B) = 0,25×4 + 0,20×3 + 0,20×4 + 0,15×3 + 0,10×3 + 0,10×4 = 3,55</w:t>
+        <w:t>S(B) = 0,25×4 + 0,20×4 + 0,20×3 + 0,15×4 + 0,10×3 + 0,10×4 = 3,70</w:t>
       </w:r>
     </w:p>
     <w:p>
@@ -1899,7 +1899,7 @@
           <w:b w:val="0"/>
           <w:i w:val="0"/>
         </w:rPr>
-        <w:t>El criterio más influyente se definió como el que más aporta a la diferencia entre agentes, es decir, el de mayor wᵢ·|pA − pB|. Resultó ser «Complejidad de IA» (aporte de 0,30 puntos). Su peso se modificó en +10 y −10 puntos porcentuales y los demás pesos se reescalaron proporcionalmente para sumar 100 %.</w:t>
+        <w:t>El criterio más influyente se definió como el que más aporta a la diferencia entre agentes, es decir, el de mayor wᵢ·|pA − pB|. Hay un empate: «Disponibilidad de datos o entorno», «Medibilidad del desempeño», «Costo y recursos» aportan 0,20 puntos cada uno. Como el empate impide elegir uno solo, se probó cada uno de ellos con +10 y −10 puntos porcentuales de peso, reescalando los demás proporcionalmente para sumar 100 %.</w:t>
       </w:r>
     </w:p>
     <w:p>
@@ -2089,7 +2089,7 @@
                 <w:b w:val="0"/>
                 <w:sz w:val="16"/>
               </w:rPr>
-              <w:t>3,550</w:t>
+              <w:t>3,700</w:t>
             </w:r>
           </w:p>
         </w:tc>
@@ -2130,7 +2130,7 @@
                 <w:b w:val="0"/>
                 <w:sz w:val="16"/>
               </w:rPr>
-              <w:t>+10 pp</w:t>
+              <w:t>Disponibilidad de datos o entorno +10 pp</w:t>
             </w:r>
           </w:p>
         </w:tc>
@@ -2148,7 +2148,7 @@
                 <w:b w:val="0"/>
                 <w:sz w:val="16"/>
               </w:rPr>
-              <w:t>22,1 / 17,6 / 17,6 / 25,0 / 8,8 / 8,8</w:t>
+              <w:t>21,9 / 30,0 / 17,5 / 13,1 / 8,8 / 8,8</w:t>
             </w:r>
           </w:p>
         </w:tc>
@@ -2166,7 +2166,7 @@
                 <w:b w:val="0"/>
                 <w:sz w:val="16"/>
               </w:rPr>
-              <w:t>4,162</w:t>
+              <w:t>3,919</w:t>
             </w:r>
           </w:p>
         </w:tc>
@@ -2184,7 +2184,7 @@
                 <w:b w:val="0"/>
                 <w:sz w:val="16"/>
               </w:rPr>
-              <w:t>3,485</w:t>
+              <w:t>3,737</w:t>
             </w:r>
           </w:p>
         </w:tc>
@@ -2225,7 +2225,7 @@
                 <w:b w:val="0"/>
                 <w:sz w:val="16"/>
               </w:rPr>
-              <w:t>-10 pp</w:t>
+              <w:t>Disponibilidad de datos o entorno -10 pp</w:t>
             </w:r>
           </w:p>
         </w:tc>
@@ -2243,7 +2243,7 @@
                 <w:b w:val="0"/>
                 <w:sz w:val="16"/>
               </w:rPr>
-              <w:t>27,9 / 22,4 / 22,4 / 5,0 / 11,2 / 11,2</w:t>
+              <w:t>28,1 / 10,0 / 22,5 / 16,9 / 11,2 / 11,2</w:t>
             </w:r>
           </w:p>
         </w:tc>
@@ -2261,7 +2261,7 @@
                 <w:b w:val="0"/>
                 <w:sz w:val="16"/>
               </w:rPr>
-              <w:t>3,938</w:t>
+              <w:t>4,181</w:t>
             </w:r>
           </w:p>
         </w:tc>
@@ -2279,7 +2279,7 @@
                 <w:b w:val="0"/>
                 <w:sz w:val="16"/>
               </w:rPr>
-              <w:t>3,615</w:t>
+              <w:t>3,663</w:t>
             </w:r>
           </w:p>
         </w:tc>
@@ -2320,7 +2320,7 @@
                 <w:b w:val="0"/>
                 <w:sz w:val="16"/>
               </w:rPr>
-              <w:t>Pesos iguales (1/6)</w:t>
+              <w:t>Medibilidad del desempeño +10 pp</w:t>
             </w:r>
           </w:p>
         </w:tc>
@@ -2338,7 +2338,7 @@
                 <w:b w:val="0"/>
                 <w:sz w:val="16"/>
               </w:rPr>
-              <w:t>16,7 / 16,7 / 16,7 / 16,7 / 16,7 / 16,7</w:t>
+              <w:t>21,9 / 17,5 / 30,0 / 13,1 / 8,8 / 8,8</w:t>
             </w:r>
           </w:p>
         </w:tc>
@@ -2356,7 +2356,7 @@
                 <w:b w:val="0"/>
                 <w:sz w:val="16"/>
               </w:rPr>
-              <w:t>4,167</w:t>
+              <w:t>4,044</w:t>
             </w:r>
           </w:p>
         </w:tc>
@@ -2374,7 +2374,7 @@
                 <w:b w:val="0"/>
                 <w:sz w:val="16"/>
               </w:rPr>
-              <w:t>3,500</w:t>
+              <w:t>3,612</w:t>
             </w:r>
           </w:p>
         </w:tc>
@@ -2415,7 +2415,7 @@
                 <w:b w:val="0"/>
                 <w:sz w:val="16"/>
               </w:rPr>
-              <w:t>Robustez: puntajes estimados de B + 1 (tope 5), pesos originales</w:t>
+              <w:t>Medibilidad del desempeño -10 pp</w:t>
             </w:r>
           </w:p>
         </w:tc>
@@ -2433,6 +2433,386 @@
                 <w:b w:val="0"/>
                 <w:sz w:val="16"/>
               </w:rPr>
+              <w:t>28,1 / 22,5 / 10,0 / 16,9 / 11,2 / 11,2</w:t>
+            </w:r>
+          </w:p>
+        </w:tc>
+        <w:tc>
+          <w:tcPr>
+            <w:tcW w:type="dxa" w:w="850"/>
+          </w:tcPr>
+          <w:p>
+            <w:pPr>
+              <w:spacing w:after="0"/>
+            </w:pPr>
+            <w:r/>
+            <w:r>
+              <w:rPr>
+                <w:b w:val="0"/>
+                <w:sz w:val="16"/>
+              </w:rPr>
+              <w:t>4,056</w:t>
+            </w:r>
+          </w:p>
+        </w:tc>
+        <w:tc>
+          <w:tcPr>
+            <w:tcW w:type="dxa" w:w="850"/>
+          </w:tcPr>
+          <w:p>
+            <w:pPr>
+              <w:spacing w:after="0"/>
+            </w:pPr>
+            <w:r/>
+            <w:r>
+              <w:rPr>
+                <w:b w:val="0"/>
+                <w:sz w:val="16"/>
+              </w:rPr>
+              <w:t>3,788</w:t>
+            </w:r>
+          </w:p>
+        </w:tc>
+        <w:tc>
+          <w:tcPr>
+            <w:tcW w:type="dxa" w:w="907"/>
+          </w:tcPr>
+          <w:p>
+            <w:pPr>
+              <w:spacing w:after="0"/>
+            </w:pPr>
+            <w:r/>
+            <w:r>
+              <w:rPr>
+                <w:b w:val="0"/>
+                <w:sz w:val="16"/>
+              </w:rPr>
+              <w:t>A</w:t>
+            </w:r>
+          </w:p>
+        </w:tc>
+      </w:tr>
+      <w:tr>
+        <w:trPr>
+          <w:cantSplit w:val="true"/>
+        </w:trPr>
+        <w:tc>
+          <w:tcPr>
+            <w:tcW w:type="dxa" w:w="2494"/>
+          </w:tcPr>
+          <w:p>
+            <w:pPr>
+              <w:spacing w:after="0"/>
+            </w:pPr>
+            <w:r/>
+            <w:r>
+              <w:rPr>
+                <w:b w:val="0"/>
+                <w:sz w:val="16"/>
+              </w:rPr>
+              <w:t>Costo y recursos +10 pp</w:t>
+            </w:r>
+          </w:p>
+        </w:tc>
+        <w:tc>
+          <w:tcPr>
+            <w:tcW w:type="dxa" w:w="3628"/>
+          </w:tcPr>
+          <w:p>
+            <w:pPr>
+              <w:spacing w:after="0"/>
+            </w:pPr>
+            <w:r/>
+            <w:r>
+              <w:rPr>
+                <w:b w:val="0"/>
+                <w:sz w:val="16"/>
+              </w:rPr>
+              <w:t>22,2 / 17,8 / 17,8 / 13,3 / 20,0 / 8,9</w:t>
+            </w:r>
+          </w:p>
+        </w:tc>
+        <w:tc>
+          <w:tcPr>
+            <w:tcW w:type="dxa" w:w="850"/>
+          </w:tcPr>
+          <w:p>
+            <w:pPr>
+              <w:spacing w:after="0"/>
+            </w:pPr>
+            <w:r/>
+            <w:r>
+              <w:rPr>
+                <w:b w:val="0"/>
+                <w:sz w:val="16"/>
+              </w:rPr>
+              <w:t>4,156</w:t>
+            </w:r>
+          </w:p>
+        </w:tc>
+        <w:tc>
+          <w:tcPr>
+            <w:tcW w:type="dxa" w:w="850"/>
+          </w:tcPr>
+          <w:p>
+            <w:pPr>
+              <w:spacing w:after="0"/>
+            </w:pPr>
+            <w:r/>
+            <w:r>
+              <w:rPr>
+                <w:b w:val="0"/>
+                <w:sz w:val="16"/>
+              </w:rPr>
+              <w:t>3,622</w:t>
+            </w:r>
+          </w:p>
+        </w:tc>
+        <w:tc>
+          <w:tcPr>
+            <w:tcW w:type="dxa" w:w="907"/>
+          </w:tcPr>
+          <w:p>
+            <w:pPr>
+              <w:spacing w:after="0"/>
+            </w:pPr>
+            <w:r/>
+            <w:r>
+              <w:rPr>
+                <w:b w:val="0"/>
+                <w:sz w:val="16"/>
+              </w:rPr>
+              <w:t>A</w:t>
+            </w:r>
+          </w:p>
+        </w:tc>
+      </w:tr>
+      <w:tr>
+        <w:trPr>
+          <w:cantSplit w:val="true"/>
+        </w:trPr>
+        <w:tc>
+          <w:tcPr>
+            <w:tcW w:type="dxa" w:w="2494"/>
+          </w:tcPr>
+          <w:p>
+            <w:pPr>
+              <w:spacing w:after="0"/>
+            </w:pPr>
+            <w:r/>
+            <w:r>
+              <w:rPr>
+                <w:b w:val="0"/>
+                <w:sz w:val="16"/>
+              </w:rPr>
+              <w:t>Costo y recursos -10 pp</w:t>
+            </w:r>
+          </w:p>
+        </w:tc>
+        <w:tc>
+          <w:tcPr>
+            <w:tcW w:type="dxa" w:w="3628"/>
+          </w:tcPr>
+          <w:p>
+            <w:pPr>
+              <w:spacing w:after="0"/>
+            </w:pPr>
+            <w:r/>
+            <w:r>
+              <w:rPr>
+                <w:b w:val="0"/>
+                <w:sz w:val="16"/>
+              </w:rPr>
+              <w:t>27,8 / 22,2 / 22,2 / 16,7 / 0,0 / 11,1</w:t>
+            </w:r>
+          </w:p>
+        </w:tc>
+        <w:tc>
+          <w:tcPr>
+            <w:tcW w:type="dxa" w:w="850"/>
+          </w:tcPr>
+          <w:p>
+            <w:pPr>
+              <w:spacing w:after="0"/>
+            </w:pPr>
+            <w:r/>
+            <w:r>
+              <w:rPr>
+                <w:b w:val="0"/>
+                <w:sz w:val="16"/>
+              </w:rPr>
+              <w:t>3,944</w:t>
+            </w:r>
+          </w:p>
+        </w:tc>
+        <w:tc>
+          <w:tcPr>
+            <w:tcW w:type="dxa" w:w="850"/>
+          </w:tcPr>
+          <w:p>
+            <w:pPr>
+              <w:spacing w:after="0"/>
+            </w:pPr>
+            <w:r/>
+            <w:r>
+              <w:rPr>
+                <w:b w:val="0"/>
+                <w:sz w:val="16"/>
+              </w:rPr>
+              <w:t>3,778</w:t>
+            </w:r>
+          </w:p>
+        </w:tc>
+        <w:tc>
+          <w:tcPr>
+            <w:tcW w:type="dxa" w:w="907"/>
+          </w:tcPr>
+          <w:p>
+            <w:pPr>
+              <w:spacing w:after="0"/>
+            </w:pPr>
+            <w:r/>
+            <w:r>
+              <w:rPr>
+                <w:b w:val="0"/>
+                <w:sz w:val="16"/>
+              </w:rPr>
+              <w:t>A</w:t>
+            </w:r>
+          </w:p>
+        </w:tc>
+      </w:tr>
+      <w:tr>
+        <w:trPr>
+          <w:cantSplit w:val="true"/>
+        </w:trPr>
+        <w:tc>
+          <w:tcPr>
+            <w:tcW w:type="dxa" w:w="2494"/>
+          </w:tcPr>
+          <w:p>
+            <w:pPr>
+              <w:spacing w:after="0"/>
+            </w:pPr>
+            <w:r/>
+            <w:r>
+              <w:rPr>
+                <w:b w:val="0"/>
+                <w:sz w:val="16"/>
+              </w:rPr>
+              <w:t>Pesos iguales (1/6)</w:t>
+            </w:r>
+          </w:p>
+        </w:tc>
+        <w:tc>
+          <w:tcPr>
+            <w:tcW w:type="dxa" w:w="3628"/>
+          </w:tcPr>
+          <w:p>
+            <w:pPr>
+              <w:spacing w:after="0"/>
+            </w:pPr>
+            <w:r/>
+            <w:r>
+              <w:rPr>
+                <w:b w:val="0"/>
+                <w:sz w:val="16"/>
+              </w:rPr>
+              <w:t>16,7 / 16,7 / 16,7 / 16,7 / 16,7 / 16,7</w:t>
+            </w:r>
+          </w:p>
+        </w:tc>
+        <w:tc>
+          <w:tcPr>
+            <w:tcW w:type="dxa" w:w="850"/>
+          </w:tcPr>
+          <w:p>
+            <w:pPr>
+              <w:spacing w:after="0"/>
+            </w:pPr>
+            <w:r/>
+            <w:r>
+              <w:rPr>
+                <w:b w:val="0"/>
+                <w:sz w:val="16"/>
+              </w:rPr>
+              <w:t>4,167</w:t>
+            </w:r>
+          </w:p>
+        </w:tc>
+        <w:tc>
+          <w:tcPr>
+            <w:tcW w:type="dxa" w:w="850"/>
+          </w:tcPr>
+          <w:p>
+            <w:pPr>
+              <w:spacing w:after="0"/>
+            </w:pPr>
+            <w:r/>
+            <w:r>
+              <w:rPr>
+                <w:b w:val="0"/>
+                <w:sz w:val="16"/>
+              </w:rPr>
+              <w:t>3,667</w:t>
+            </w:r>
+          </w:p>
+        </w:tc>
+        <w:tc>
+          <w:tcPr>
+            <w:tcW w:type="dxa" w:w="907"/>
+          </w:tcPr>
+          <w:p>
+            <w:pPr>
+              <w:spacing w:after="0"/>
+            </w:pPr>
+            <w:r/>
+            <w:r>
+              <w:rPr>
+                <w:b w:val="0"/>
+                <w:sz w:val="16"/>
+              </w:rPr>
+              <w:t>A</w:t>
+            </w:r>
+          </w:p>
+        </w:tc>
+      </w:tr>
+      <w:tr>
+        <w:trPr>
+          <w:cantSplit w:val="true"/>
+        </w:trPr>
+        <w:tc>
+          <w:tcPr>
+            <w:tcW w:type="dxa" w:w="2494"/>
+          </w:tcPr>
+          <w:p>
+            <w:pPr>
+              <w:spacing w:after="0"/>
+            </w:pPr>
+            <w:r/>
+            <w:r>
+              <w:rPr>
+                <w:b w:val="0"/>
+                <w:sz w:val="16"/>
+              </w:rPr>
+              <w:t>Robustez: puntajes de B + 1 en todos los criterios (tope 5), pesos originales</w:t>
+            </w:r>
+          </w:p>
+        </w:tc>
+        <w:tc>
+          <w:tcPr>
+            <w:tcW w:type="dxa" w:w="3628"/>
+          </w:tcPr>
+          <w:p>
+            <w:pPr>
+              <w:spacing w:after="0"/>
+            </w:pPr>
+            <w:r/>
+            <w:r>
+              <w:rPr>
+                <w:b w:val="0"/>
+                <w:sz w:val="16"/>
+              </w:rPr>
               <w:t>25 / 20 / 20 / 15 / 10 / 10</w:t>
             </w:r>
           </w:p>
@@ -2469,7 +2849,7 @@
                 <w:b w:val="0"/>
                 <w:sz w:val="16"/>
               </w:rPr>
-              <w:t>4,550</w:t>
+              <w:t>4,700</w:t>
             </w:r>
           </w:p>
         </w:tc>
@@ -2504,7 +2884,7 @@
           <w:b w:val="0"/>
           <w:i w:val="0"/>
         </w:rPr>
-        <w:t>Resultado: con los puntajes actuales la decisión se mantiene en A en los cuatro escenarios de pesos (original, +10 pp, −10 pp y pesos iguales). La ventaja mínima de A es de 0,32 puntos (escenario −10 pp). En cambio, la decisión no es robusta a los puntajes de B: si el diseño real de Cartrescue-agent justificara un punto más en cada criterio estimado, B obtendría 4,55 frente a 4,05 y pasaría a ser la mejor opción. La ventaja de A tiene que confirmarse con el diseño real de B.</w:t>
+        <w:t>Resultado: con los puntajes actuales la decisión se mantiene en A en los 8 escenarios de pesos (original, +10 pp y −10 pp de cada criterio empatado, y pesos iguales). La ventaja mínima de A es de 0,17 puntos (escenario «Costo y recursos -10 pp»). En cambio, la decisión no es robusta a los puntajes de B: la ventaja de A con los pesos originales es de 0,35 puntos, que equivale a un punto de diferencia en criterios que sumen un 35 % del peso (por ejemplo, viabilidad técnica y costo). Si el diseño real de Cartrescue-agent justificara un punto más en todos los criterios, B obtendría 4,70 frente a 4,05 y pasaría a ser la mejor opción. La ventaja de A debe confirmarse con el diseño real de B.</w:t>
       </w:r>
     </w:p>
     <w:p>
@@ -2521,7 +2901,7 @@
           <w:b w:val="0"/>
           <w:i w:val="0"/>
         </w:rPr>
-        <w:t>Se selecciona CREDITSCORE-AGENT con un puntaje ponderado de 4,05 sobre 5, frente a 3,55 estimado para Cartrescue-agent. La diferencia proviene sobre todo de dos criterios: complejidad de IA (A aporta un agente de aprendizaje con decisión por utilidad y abstención por incertidumbre, mientras que B se estimó como agente de reglas o utilidad) y costo y recursos (A funciona con Python y numpy sin APIs de pago, mientras que el envío real de recordatorios de B suele requerir servicios con cuota).</w:t>
+        <w:t>Se selecciona CREDITSCORE-AGENT con un puntaje ponderado de 4,05 sobre 5, frente a 3,70 para Cartrescue-agent. A supera a B en medibilidad del desempeño (0,20), complejidad de ia (0,15), costo y recursos (0,20): la meta de A puede medirse sin tienda piloto, funciona con Python y numpy sin APIs ni servicios de pago, y es un agente de aprendizaje con decisión por utilidad y abstención por incertidumbre. B supera a A en disponibilidad de datos o entorno (0,20), porque cuenta con un conjunto público real (REES46). Viabilidad técnica y valor del problema empatan.</w:t>
       </w:r>
     </w:p>
     <w:p>
@@ -2530,7 +2910,7 @@
           <w:b w:val="0"/>
           <w:i w:val="0"/>
         </w:rPr>
-        <w:t>Resultado de la sensibilidad: al subir o bajar 10 puntos el peso de la complejidad de IA, A conserva el primer lugar (4,16 frente a 3,49 y 3,94 frente a 3,61). Con pesos iguales A también gana (4,17 frente a 3,50). La decisión depende de los puntajes estimados de B, como se indicó en A.2.</w:t>
+        <w:t>Resultado de la sensibilidad: al subir o bajar 10 puntos el peso de cada criterio empatado, A conserva el primer lugar en los seis casos (la menor ventaja es 0,17 puntos). Con pesos iguales A también gana (4,17 frente a 3,67). La decisión depende de los puntajes de B, como se indicó en A.2.</w:t>
       </w:r>
     </w:p>
     <w:p>
@@ -2548,7 +2928,7 @@
           <w:b w:val="0"/>
           <w:i w:val="0"/>
         </w:rPr>
-        <w:t>Qué se pierde al descartar a Cartrescue-agent: un problema con retroalimentación inmediata (el cliente compra o no tras el recordatorio), que permitiría medir el aprendizaje en ciclos cortos, y un dominio con menor riesgo ético que las decisiones crediticias. Si el diseño real de Cartrescue-agent incluye aprendizaje y datos disponibles, esta decisión debe revisarse.</w:t>
+        <w:t>Qué se pierde al descartar a Cartrescue-agent: un problema con retroalimentación inmediata (el cliente compra o no tras el recordatorio), que permitiría medir el aprendizaje en ciclos cortos; un conjunto de datos público y real (REES46); y un dominio con menor riesgo ético que las decisiones crediticias. La descripción del caso confirma que Cartrescue-agent también aprende de los resultados y dispone de datos, y aun así la decisión se mantiene en A por medibilidad y costo; debe revisarse solo si el diseño completo de B justifica puntajes más altos en esos criterios.</w:t>
       </w:r>
     </w:p>
     <w:p>

</xml_diff>